<commit_message>
chore: update document templates for form-based requests
</commit_message>
<xml_diff>
--- a/templates/forms/form_hoan_vu_template.docx
+++ b/templates/forms/form_hoan_vu_template.docx
@@ -874,7 +874,7 @@
                 <w:sz w:val="24"/>
                 <w:szCs w:val="24"/>
               </w:rPr>
-              <w:t>kg</w:t>
+              <w:t>KG</w:t>
             </w:r>
             <w:r>
               <w:rPr>
@@ -3716,7 +3716,7 @@
                 <w:sz w:val="24"/>
                 <w:szCs w:val="24"/>
               </w:rPr>
-              <w:t>台語</w:t>
+              <w:t/>
             </w:r>
             <w:r>
               <w:rPr>

</xml_diff>

<commit_message>
feat: update placeholders and content in form templates
</commit_message>
<xml_diff>
--- a/templates/forms/form_hoan_vu_template.docx
+++ b/templates/forms/form_hoan_vu_template.docx
@@ -3652,8 +3652,8 @@
         </w:tc>
         <w:tc>
           <w:tcPr>
-            <w:tcW w:w="1349" w:type="dxa"/>
-            <w:gridSpan w:val="3"/>
+            <w:tcW w:w="2699" w:type="dxa"/>
+            <w:gridSpan w:val="9"/>
             <w:vAlign w:val="center"/>
           </w:tcPr>
           <w:p>
@@ -3690,49 +3690,6 @@
                 <w:szCs w:val="24"/>
               </w:rPr>
               <w:t>{langAnh}</w:t>
-            </w:r>
-          </w:p>
-        </w:tc>
-        <w:tc>
-          <w:tcPr>
-            <w:tcW w:w="1350" w:type="dxa"/>
-            <w:gridSpan w:val="6"/>
-            <w:vAlign w:val="center"/>
-          </w:tcPr>
-          <w:p>
-            <w:pPr>
-              <w:ind w:right="-108" w:hanging="108"/>
-              <w:jc w:val="center"/>
-              <w:rPr>
-                <w:rFonts w:ascii="Times New Roman" w:eastAsia="DFKai-SB" w:hAnsi="Times New Roman" w:cs="Times New Roman"/>
-                <w:sz w:val="24"/>
-                <w:szCs w:val="24"/>
-                <w:lang w:eastAsia="zh-TW"/>
-              </w:rPr>
-            </w:pPr>
-            <w:r>
-              <w:rPr>
-                <w:rFonts w:ascii="Times New Roman" w:eastAsia="DFKai-SB" w:hAnsi="Times New Roman" w:cs="Times New Roman"/>
-                <w:sz w:val="24"/>
-                <w:szCs w:val="24"/>
-              </w:rPr>
-              <w:t/>
-            </w:r>
-            <w:r>
-              <w:rPr>
-                <w:rFonts w:ascii="Times New Roman" w:eastAsia="DFKai-SB" w:hAnsi="Times New Roman" w:cs="Times New Roman"/>
-                <w:sz w:val="24"/>
-                <w:szCs w:val="24"/>
-              </w:rPr>
-              <w:t xml:space="preserve"> Đài </w:t>
-            </w:r>
-            <w:r>
-              <w:rPr>
-                <w:rFonts w:ascii="Times New Roman" w:eastAsia="DFKai-SB" w:hAnsi="Times New Roman" w:cs="Times New Roman"/>
-                <w:sz w:val="36"/>
-                <w:szCs w:val="24"/>
-              </w:rPr>
-              <w:t>{langDai}</w:t>
             </w:r>
           </w:p>
         </w:tc>

</xml_diff>